<commit_message>
resume updated. IDK WHY
</commit_message>
<xml_diff>
--- a/Kunj.docx
+++ b/Kunj.docx
@@ -3739,11 +3739,101 @@
           <w:sz w:val="24"/>
           <w:szCs w:val="24"/>
         </w:rPr>
-        <w:t xml:space="preserve"> </w:t>
+        <w:tab/>
       </w:r>
       <w:r>
         <w:rPr>
           <w:b/>
+          <w:color w:val="000000"/>
+          <w:spacing w:val="6640"/>
+          <w:sz w:val="24"/>
+          <w:szCs w:val="24"/>
+        </w:rPr>
+        <w:tab/>
+      </w:r>
+      <w:r>
+        <w:rPr>
+          <w:b/>
+          <w:color w:val="000000"/>
+          <w:spacing w:val="6640"/>
+          <w:sz w:val="24"/>
+          <w:szCs w:val="24"/>
+        </w:rPr>
+        <w:tab/>
+      </w:r>
+      <w:r>
+        <w:rPr>
+          <w:b/>
+          <w:color w:val="000000"/>
+          <w:spacing w:val="6640"/>
+          <w:sz w:val="24"/>
+          <w:szCs w:val="24"/>
+        </w:rPr>
+        <w:tab/>
+      </w:r>
+      <w:r>
+        <w:rPr>
+          <w:b/>
+          <w:color w:val="000000"/>
+          <w:spacing w:val="6640"/>
+          <w:sz w:val="24"/>
+          <w:szCs w:val="24"/>
+        </w:rPr>
+        <w:tab/>
+      </w:r>
+      <w:r>
+        <w:rPr>
+          <w:b/>
+          <w:color w:val="000000"/>
+          <w:spacing w:val="6640"/>
+          <w:sz w:val="24"/>
+          <w:szCs w:val="24"/>
+        </w:rPr>
+        <w:tab/>
+      </w:r>
+      <w:r>
+        <w:rPr>
+          <w:b/>
+          <w:color w:val="000000"/>
+          <w:spacing w:val="6640"/>
+          <w:sz w:val="24"/>
+          <w:szCs w:val="24"/>
+        </w:rPr>
+        <w:tab/>
+      </w:r>
+      <w:r>
+        <w:rPr>
+          <w:b/>
+          <w:color w:val="000000"/>
+          <w:spacing w:val="6640"/>
+          <w:sz w:val="24"/>
+          <w:szCs w:val="24"/>
+        </w:rPr>
+        <w:tab/>
+      </w:r>
+      <w:r>
+        <w:rPr>
+          <w:b/>
+          <w:color w:val="000000"/>
+          <w:spacing w:val="6640"/>
+          <w:sz w:val="24"/>
+          <w:szCs w:val="24"/>
+        </w:rPr>
+        <w:tab/>
+      </w:r>
+      <w:r>
+        <w:rPr>
+          <w:b/>
+          <w:color w:val="000000"/>
+          <w:spacing w:val="6640"/>
+          <w:sz w:val="24"/>
+          <w:szCs w:val="24"/>
+        </w:rPr>
+        <w:tab/>
+      </w:r>
+      <w:r>
+        <w:rPr>
+          <w:b/>
           <w:noProof/>
           <w:color w:val="000000"/>
           <w:sz w:val="24"/>
@@ -3810,7 +3900,7 @@
           <w:sz w:val="24"/>
           <w:szCs w:val="24"/>
         </w:rPr>
-        <w:t>Present</w:t>
+        <w:t>Apr 2026</w:t>
       </w:r>
     </w:p>
     <w:p>
@@ -10344,6 +10434,29 @@
     <w:semiHidden/>
     <w:unhideWhenUsed/>
   </w:style>
+  <w:style w:type="character" w:styleId="Hyperlink">
+    <w:name w:val="Hyperlink"/>
+    <w:basedOn w:val="DefaultParagraphFont"/>
+    <w:uiPriority w:val="99"/>
+    <w:unhideWhenUsed/>
+    <w:rsid w:val="006B47AB"/>
+    <w:rPr>
+      <w:color w:val="0000FF" w:themeColor="hyperlink"/>
+      <w:u w:val="single"/>
+    </w:rPr>
+  </w:style>
+  <w:style w:type="character" w:styleId="UnresolvedMention">
+    <w:name w:val="Unresolved Mention"/>
+    <w:basedOn w:val="DefaultParagraphFont"/>
+    <w:uiPriority w:val="99"/>
+    <w:semiHidden/>
+    <w:unhideWhenUsed/>
+    <w:rsid w:val="006B47AB"/>
+    <w:rPr>
+      <w:color w:val="605E5C"/>
+      <w:shd w:val="clear" w:color="auto" w:fill="E1DFDD"/>
+    </w:rPr>
+  </w:style>
 </w:styles>
 </file>
 

</xml_diff>

<commit_message>
new thicc resume added
</commit_message>
<xml_diff>
--- a/Kunj.docx
+++ b/Kunj.docx
@@ -1,6 +1,6 @@
 
 <file path=word/document.xml><?xml version="1.0" encoding="utf-8"?>
-<w:document xmlns:wpc="http://schemas.microsoft.com/office/word/2010/wordprocessingCanvas" xmlns:cx="http://schemas.microsoft.com/office/drawing/2014/chartex" xmlns:cx1="http://schemas.microsoft.com/office/drawing/2015/9/8/chartex" xmlns:cx2="http://schemas.microsoft.com/office/drawing/2015/10/21/chartex" xmlns:cx3="http://schemas.microsoft.com/office/drawing/2016/5/9/chartex" xmlns:cx4="http://schemas.microsoft.com/office/drawing/2016/5/10/chartex" xmlns:cx5="http://schemas.microsoft.com/office/drawing/2016/5/11/chartex" xmlns:cx6="http://schemas.microsoft.com/office/drawing/2016/5/12/chartex" xmlns:cx7="http://schemas.microsoft.com/office/drawing/2016/5/13/chartex" xmlns:cx8="http://schemas.microsoft.com/office/drawing/2016/5/14/chartex" xmlns:mc="http://schemas.openxmlformats.org/markup-compatibility/2006" xmlns:aink="http://schemas.microsoft.com/office/drawing/2016/ink" xmlns:am3d="http://schemas.microsoft.com/office/drawing/2017/model3d" xmlns:o="urn:schemas-microsoft-com:office:office" xmlns:oel="http://schemas.microsoft.com/office/2019/extlst" xmlns:r="http://schemas.openxmlformats.org/officeDocument/2006/relationships" xmlns:m="http://schemas.openxmlformats.org/officeDocument/2006/math" xmlns:v="urn:schemas-microsoft-com:vml" xmlns:wp14="http://schemas.microsoft.com/office/word/2010/wordprocessingDrawing" xmlns:wp="http://schemas.openxmlformats.org/drawingml/2006/wordprocessingDrawing" xmlns:w10="urn:schemas-microsoft-com:office:word" xmlns:w="http://schemas.openxmlformats.org/wordprocessingml/2006/main" xmlns:w14="http://schemas.microsoft.com/office/word/2010/wordml" xmlns:w15="http://schemas.microsoft.com/office/word/2012/wordml" xmlns:w16cei="http://schemas.microsoft.com/office/word/2026/wordml/cei" xmlns:w16cex="http://schemas.microsoft.com/office/word/2018/wordml/cex" xmlns:w16cid="http://schemas.microsoft.com/office/word/2016/wordml/cid" xmlns:w16="http://schemas.microsoft.com/office/word/2018/wordml" xmlns:w16du="http://schemas.microsoft.com/office/word/2023/wordml/word16du" xmlns:w16sdtdh="http://schemas.microsoft.com/office/word/2020/wordml/sdtdatahash" xmlns:w16sdtfl="http://schemas.microsoft.com/office/word/2024/wordml/sdtformatlock" xmlns:w16se="http://schemas.microsoft.com/office/word/2015/wordml/symex" xmlns:wpg="http://schemas.microsoft.com/office/word/2010/wordprocessingGroup" xmlns:wpi="http://schemas.microsoft.com/office/word/2010/wordprocessingInk" xmlns:wne="http://schemas.microsoft.com/office/word/2006/wordml" xmlns:wps="http://schemas.microsoft.com/office/word/2010/wordprocessingShape" mc:Ignorable="w14 w15 w16se w16cid w16 w16cex w16sdtdh w16sdtfl w16du wp14">
+<w:document xmlns:wpc="http://schemas.microsoft.com/office/word/2010/wordprocessingCanvas" xmlns:cx="http://schemas.microsoft.com/office/drawing/2014/chartex" xmlns:cx1="http://schemas.microsoft.com/office/drawing/2015/9/8/chartex" xmlns:cx2="http://schemas.microsoft.com/office/drawing/2015/10/21/chartex" xmlns:cx3="http://schemas.microsoft.com/office/drawing/2016/5/9/chartex" xmlns:cx4="http://schemas.microsoft.com/office/drawing/2016/5/10/chartex" xmlns:cx5="http://schemas.microsoft.com/office/drawing/2016/5/11/chartex" xmlns:cx6="http://schemas.microsoft.com/office/drawing/2016/5/12/chartex" xmlns:cx7="http://schemas.microsoft.com/office/drawing/2016/5/13/chartex" xmlns:cx8="http://schemas.microsoft.com/office/drawing/2016/5/14/chartex" xmlns:mc="http://schemas.openxmlformats.org/markup-compatibility/2006" xmlns:aink="http://schemas.microsoft.com/office/drawing/2016/ink" xmlns:am3d="http://schemas.microsoft.com/office/drawing/2017/model3d" xmlns:o="urn:schemas-microsoft-com:office:office" xmlns:oel="http://schemas.microsoft.com/office/2019/extlst" xmlns:r="http://schemas.openxmlformats.org/officeDocument/2006/relationships" xmlns:m="http://schemas.openxmlformats.org/officeDocument/2006/math" xmlns:v="urn:schemas-microsoft-com:vml" xmlns:wp14="http://schemas.microsoft.com/office/word/2010/wordprocessingDrawing" xmlns:wp="http://schemas.openxmlformats.org/drawingml/2006/wordprocessingDrawing" xmlns:w10="urn:schemas-microsoft-com:office:word" xmlns:w="http://schemas.openxmlformats.org/wordprocessingml/2006/main" xmlns:w14="http://schemas.microsoft.com/office/word/2010/wordml" xmlns:w15="http://schemas.microsoft.com/office/word/2012/wordml" xmlns:w16cex="http://schemas.microsoft.com/office/word/2018/wordml/cex" xmlns:w16cid="http://schemas.microsoft.com/office/word/2016/wordml/cid" xmlns:w16="http://schemas.microsoft.com/office/word/2018/wordml" xmlns:w16du="http://schemas.microsoft.com/office/word/2023/wordml/word16du" xmlns:w16sdtdh="http://schemas.microsoft.com/office/word/2020/wordml/sdtdatahash" xmlns:w16sdtfl="http://schemas.microsoft.com/office/word/2024/wordml/sdtformatlock" xmlns:w16se="http://schemas.microsoft.com/office/word/2015/wordml/symex" xmlns:wpg="http://schemas.microsoft.com/office/word/2010/wordprocessingGroup" xmlns:wpi="http://schemas.microsoft.com/office/word/2010/wordprocessingInk" xmlns:wne="http://schemas.microsoft.com/office/word/2006/wordml" xmlns:wps="http://schemas.microsoft.com/office/word/2010/wordprocessingShape" mc:Ignorable="w14 w15 w16se w16cid w16 w16cex w16sdtdh w16sdtfl w16du wp14">
   <w:body>
     <w:p>
       <w:pPr>
@@ -70,301 +70,9 @@
         <w:adjustRightInd w:val="0"/>
         <w:spacing w:before="22" w:line="260" w:lineRule="auto"/>
         <w:ind w:left="360" w:right="100" w:hanging="256"/>
+        <w:jc w:val="center"/>
         <w:textAlignment w:val="baseline"/>
       </w:pPr>
-      <w:r>
-        <w:rPr>
-          <w:noProof/>
-          <w:color w:val="000000"/>
-        </w:rPr>
-        <w:t>F-1</w:t>
-      </w:r>
-      <w:r>
-        <w:rPr>
-          <w:color w:val="000000"/>
-          <w:w w:val="91"/>
-        </w:rPr>
-        <w:t xml:space="preserve"> </w:t>
-      </w:r>
-      <w:r>
-        <w:rPr>
-          <w:noProof/>
-          <w:color w:val="000000"/>
-        </w:rPr>
-        <w:t>international</w:t>
-      </w:r>
-      <w:r>
-        <w:rPr>
-          <w:color w:val="000000"/>
-          <w:w w:val="91"/>
-        </w:rPr>
-        <w:t xml:space="preserve"> </w:t>
-      </w:r>
-      <w:r>
-        <w:rPr>
-          <w:noProof/>
-          <w:color w:val="000000"/>
-        </w:rPr>
-        <w:t>student</w:t>
-      </w:r>
-      <w:r>
-        <w:rPr>
-          <w:color w:val="000000"/>
-          <w:w w:val="91"/>
-        </w:rPr>
-        <w:t xml:space="preserve"> </w:t>
-      </w:r>
-      <w:r>
-        <w:rPr>
-          <w:noProof/>
-          <w:color w:val="000000"/>
-        </w:rPr>
-        <w:t>eligible</w:t>
-      </w:r>
-      <w:r>
-        <w:rPr>
-          <w:color w:val="000000"/>
-          <w:w w:val="91"/>
-        </w:rPr>
-        <w:t xml:space="preserve"> </w:t>
-      </w:r>
-      <w:r>
-        <w:rPr>
-          <w:noProof/>
-          <w:color w:val="000000"/>
-        </w:rPr>
-        <w:t>for</w:t>
-      </w:r>
-      <w:r>
-        <w:rPr>
-          <w:color w:val="000000"/>
-          <w:w w:val="91"/>
-        </w:rPr>
-        <w:t xml:space="preserve"> </w:t>
-      </w:r>
-      <w:r>
-        <w:rPr>
-          <w:noProof/>
-          <w:color w:val="000000"/>
-        </w:rPr>
-        <w:t>CPT</w:t>
-      </w:r>
-      <w:r>
-        <w:rPr>
-          <w:color w:val="000000"/>
-          <w:w w:val="91"/>
-        </w:rPr>
-        <w:t xml:space="preserve"> </w:t>
-      </w:r>
-      <w:r>
-        <w:rPr>
-          <w:noProof/>
-          <w:color w:val="000000"/>
-        </w:rPr>
-        <w:t>and</w:t>
-      </w:r>
-      <w:r>
-        <w:rPr>
-          <w:color w:val="000000"/>
-          <w:w w:val="91"/>
-        </w:rPr>
-        <w:t xml:space="preserve"> </w:t>
-      </w:r>
-      <w:r>
-        <w:rPr>
-          <w:noProof/>
-          <w:color w:val="000000"/>
-        </w:rPr>
-        <w:t>OPT;</w:t>
-      </w:r>
-      <w:r>
-        <w:rPr>
-          <w:color w:val="000000"/>
-          <w:w w:val="91"/>
-        </w:rPr>
-        <w:t xml:space="preserve"> </w:t>
-      </w:r>
-      <w:r>
-        <w:rPr>
-          <w:noProof/>
-          <w:color w:val="000000"/>
-        </w:rPr>
-        <w:t>eligible</w:t>
-      </w:r>
-      <w:r>
-        <w:rPr>
-          <w:color w:val="000000"/>
-          <w:w w:val="91"/>
-        </w:rPr>
-        <w:t xml:space="preserve"> </w:t>
-      </w:r>
-      <w:r>
-        <w:rPr>
-          <w:noProof/>
-          <w:color w:val="000000"/>
-        </w:rPr>
-        <w:t>for</w:t>
-      </w:r>
-      <w:r>
-        <w:rPr>
-          <w:color w:val="000000"/>
-          <w:w w:val="91"/>
-        </w:rPr>
-        <w:t xml:space="preserve"> </w:t>
-      </w:r>
-      <w:r>
-        <w:rPr>
-          <w:noProof/>
-          <w:color w:val="000000"/>
-        </w:rPr>
-        <w:t>H-1B</w:t>
-      </w:r>
-      <w:r>
-        <w:rPr>
-          <w:color w:val="000000"/>
-          <w:w w:val="91"/>
-        </w:rPr>
-        <w:t xml:space="preserve"> </w:t>
-      </w:r>
-      <w:r>
-        <w:rPr>
-          <w:noProof/>
-          <w:color w:val="000000"/>
-        </w:rPr>
-        <w:t>change</w:t>
-      </w:r>
-      <w:r>
-        <w:rPr>
-          <w:color w:val="000000"/>
-          <w:w w:val="91"/>
-        </w:rPr>
-        <w:t xml:space="preserve"> </w:t>
-      </w:r>
-      <w:r>
-        <w:rPr>
-          <w:noProof/>
-          <w:color w:val="000000"/>
-        </w:rPr>
-        <w:t>of</w:t>
-      </w:r>
-      <w:r>
-        <w:rPr>
-          <w:color w:val="000000"/>
-          <w:w w:val="91"/>
-        </w:rPr>
-        <w:t xml:space="preserve"> </w:t>
-      </w:r>
-      <w:r>
-        <w:rPr>
-          <w:noProof/>
-          <w:color w:val="000000"/>
-        </w:rPr>
-        <w:t>status.</w:t>
-      </w:r>
-      <w:r>
-        <w:rPr>
-          <w:color w:val="000000"/>
-          <w:w w:val="91"/>
-        </w:rPr>
-        <w:t xml:space="preserve"> </w:t>
-      </w:r>
-      <w:r>
-        <w:rPr>
-          <w:noProof/>
-          <w:color w:val="000000"/>
-        </w:rPr>
-        <w:t>The</w:t>
-      </w:r>
-      <w:r>
-        <w:rPr>
-          <w:color w:val="000000"/>
-          <w:w w:val="91"/>
-        </w:rPr>
-        <w:t xml:space="preserve"> </w:t>
-      </w:r>
-      <w:r>
-        <w:rPr>
-          <w:noProof/>
-          <w:color w:val="000000"/>
-        </w:rPr>
-        <w:t>$100,000</w:t>
-      </w:r>
-      <w:r>
-        <w:rPr>
-          <w:color w:val="000000"/>
-          <w:w w:val="91"/>
-        </w:rPr>
-        <w:t xml:space="preserve"> </w:t>
-      </w:r>
-      <w:r>
-        <w:rPr>
-          <w:noProof/>
-          <w:color w:val="000000"/>
-        </w:rPr>
-        <w:t>H-1B</w:t>
-      </w:r>
-      <w:r>
-        <w:rPr>
-          <w:color w:val="000000"/>
-          <w:w w:val="91"/>
-        </w:rPr>
-        <w:t xml:space="preserve"> </w:t>
-      </w:r>
-      <w:r>
-        <w:rPr>
-          <w:noProof/>
-          <w:color w:val="000000"/>
-        </w:rPr>
-        <w:t>fee</w:t>
-      </w:r>
-      <w:r>
-        <w:rPr>
-          <w:color w:val="000000"/>
-          <w:w w:val="91"/>
-        </w:rPr>
-        <w:t xml:space="preserve"> </w:t>
-      </w:r>
-      <w:r>
-        <w:rPr>
-          <w:noProof/>
-          <w:color w:val="000000"/>
-        </w:rPr>
-        <w:t>DOES</w:t>
-      </w:r>
-      <w:r>
-        <w:rPr>
-          <w:color w:val="000000"/>
-          <w:w w:val="91"/>
-        </w:rPr>
-        <w:t xml:space="preserve"> </w:t>
-      </w:r>
-      <w:r>
-        <w:rPr>
-          <w:noProof/>
-          <w:color w:val="000000"/>
-        </w:rPr>
-        <w:t>NOT</w:t>
-      </w:r>
-      <w:r>
-        <w:rPr>
-          <w:color w:val="000000"/>
-          <w:w w:val="91"/>
-        </w:rPr>
-        <w:t xml:space="preserve"> </w:t>
-      </w:r>
-      <w:r>
-        <w:rPr>
-          <w:noProof/>
-          <w:color w:val="000000"/>
-        </w:rPr>
-        <w:t>APPLY.</w:t>
-      </w:r>
-      <w:r>
-        <w:rPr>
-          <w:color w:val="000000"/>
-        </w:rPr>
-        <w:t xml:space="preserve"> </w:t>
-      </w:r>
       <w:r>
         <w:rPr>
           <w:noProof/>
@@ -566,12 +274,6 @@
           <w:t>kunjcr2.github.io</w:t>
         </w:r>
       </w:hyperlink>
-      <w:r>
-        <w:rPr>
-          <w:color w:val="000000"/>
-        </w:rPr>
-        <w:t xml:space="preserve"> </w:t>
-      </w:r>
     </w:p>
     <w:p>
       <w:pPr>
@@ -643,67 +345,67 @@
           <w:sz w:val="24"/>
           <w:szCs w:val="24"/>
         </w:rPr>
-        <w:t>San</w:t>
+        <w:t>Bachelor’s of Science, Computer Science</w:t>
       </w:r>
       <w:r>
         <w:rPr>
           <w:b/>
           <w:color w:val="000000"/>
-          <w:spacing w:val="3"/>
-          <w:sz w:val="24"/>
-          <w:szCs w:val="24"/>
-        </w:rPr>
-        <w:t xml:space="preserve"> </w:t>
+          <w:spacing w:val="6027"/>
+          <w:sz w:val="24"/>
+          <w:szCs w:val="24"/>
+        </w:rPr>
+        <w:tab/>
       </w:r>
       <w:r>
         <w:rPr>
           <w:b/>
-          <w:noProof/>
-          <w:color w:val="000000"/>
-          <w:sz w:val="24"/>
-          <w:szCs w:val="24"/>
-        </w:rPr>
-        <w:t>Jose</w:t>
+          <w:color w:val="000000"/>
+          <w:spacing w:val="6027"/>
+          <w:sz w:val="24"/>
+          <w:szCs w:val="24"/>
+        </w:rPr>
+        <w:tab/>
       </w:r>
       <w:r>
         <w:rPr>
           <w:b/>
           <w:color w:val="000000"/>
-          <w:spacing w:val="3"/>
-          <w:sz w:val="24"/>
-          <w:szCs w:val="24"/>
-        </w:rPr>
-        <w:t xml:space="preserve"> </w:t>
+          <w:spacing w:val="6027"/>
+          <w:sz w:val="24"/>
+          <w:szCs w:val="24"/>
+        </w:rPr>
+        <w:tab/>
       </w:r>
       <w:r>
         <w:rPr>
           <w:b/>
-          <w:noProof/>
-          <w:color w:val="000000"/>
-          <w:sz w:val="24"/>
-          <w:szCs w:val="24"/>
-        </w:rPr>
-        <w:t>State</w:t>
+          <w:color w:val="000000"/>
+          <w:spacing w:val="6027"/>
+          <w:sz w:val="24"/>
+          <w:szCs w:val="24"/>
+        </w:rPr>
+        <w:tab/>
       </w:r>
       <w:r>
         <w:rPr>
           <w:b/>
           <w:color w:val="000000"/>
-          <w:spacing w:val="3"/>
-          <w:sz w:val="24"/>
-          <w:szCs w:val="24"/>
-        </w:rPr>
-        <w:t xml:space="preserve"> </w:t>
+          <w:spacing w:val="6027"/>
+          <w:sz w:val="24"/>
+          <w:szCs w:val="24"/>
+        </w:rPr>
+        <w:tab/>
       </w:r>
       <w:r>
         <w:rPr>
           <w:b/>
-          <w:noProof/>
-          <w:color w:val="000000"/>
-          <w:sz w:val="24"/>
-          <w:szCs w:val="24"/>
-        </w:rPr>
-        <w:t>University</w:t>
+          <w:color w:val="000000"/>
+          <w:spacing w:val="6027"/>
+          <w:sz w:val="24"/>
+          <w:szCs w:val="24"/>
+        </w:rPr>
+        <w:tab/>
       </w:r>
       <w:r>
         <w:rPr>
@@ -713,68 +415,17 @@
           <w:sz w:val="24"/>
           <w:szCs w:val="24"/>
         </w:rPr>
-        <w:t xml:space="preserve"> </w:t>
+        <w:tab/>
       </w:r>
       <w:r>
         <w:rPr>
           <w:b/>
-          <w:noProof/>
-          <w:color w:val="000000"/>
-          <w:sz w:val="24"/>
-          <w:szCs w:val="24"/>
-        </w:rPr>
-        <w:t>Jan</w:t>
-      </w:r>
-      <w:r>
-        <w:rPr>
-          <w:b/>
-          <w:color w:val="000000"/>
-          <w:spacing w:val="-1"/>
-          <w:sz w:val="24"/>
-          <w:szCs w:val="24"/>
-        </w:rPr>
-        <w:t xml:space="preserve"> </w:t>
-      </w:r>
-      <w:r>
-        <w:rPr>
-          <w:b/>
-          <w:noProof/>
-          <w:color w:val="000000"/>
-          <w:sz w:val="24"/>
-          <w:szCs w:val="24"/>
-        </w:rPr>
-        <w:t>2026</w:t>
-      </w:r>
-      <w:r>
-        <w:rPr>
-          <w:b/>
-          <w:color w:val="000000"/>
-          <w:spacing w:val="-1"/>
-          <w:sz w:val="24"/>
-          <w:szCs w:val="24"/>
-        </w:rPr>
-        <w:t xml:space="preserve"> </w:t>
-      </w:r>
-      <w:r>
-        <w:rPr>
-          <w:b/>
-          <w:noProof/>
-          <w:color w:val="000000"/>
-          <w:spacing w:val="1"/>
-          <w:sz w:val="24"/>
-          <w:szCs w:val="24"/>
-        </w:rPr>
-        <w:t>-</w:t>
-      </w:r>
-      <w:r>
-        <w:rPr>
-          <w:b/>
-          <w:color w:val="000000"/>
-          <w:spacing w:val="-1"/>
-          <w:sz w:val="24"/>
-          <w:szCs w:val="24"/>
-        </w:rPr>
-        <w:t xml:space="preserve"> </w:t>
+          <w:color w:val="000000"/>
+          <w:spacing w:val="6027"/>
+          <w:sz w:val="24"/>
+          <w:szCs w:val="24"/>
+        </w:rPr>
+        <w:tab/>
       </w:r>
       <w:r>
         <w:rPr>
@@ -825,6 +476,12 @@
         <w:autoSpaceDN w:val="0"/>
         <w:adjustRightInd w:val="0"/>
         <w:textAlignment w:val="baseline"/>
+        <w:rPr>
+          <w:noProof/>
+          <w:color w:val="000000"/>
+          <w:sz w:val="22"/>
+          <w:szCs w:val="22"/>
+        </w:rPr>
       </w:pPr>
       <w:r>
         <w:rPr>
@@ -834,144 +491,126 @@
           <w:sz w:val="22"/>
           <w:szCs w:val="22"/>
         </w:rPr>
-        <w:t>B.S.,</w:t>
+        <w:t>San Jose S</w:t>
       </w:r>
       <w:r>
         <w:rPr>
           <w:i/>
-          <w:color w:val="000000"/>
-          <w:spacing w:val="4"/>
-          <w:sz w:val="22"/>
-          <w:szCs w:val="22"/>
-        </w:rPr>
-        <w:t xml:space="preserve"> </w:t>
-      </w:r>
-      <w:r>
-        <w:rPr>
-          <w:i/>
-          <w:noProof/>
-          <w:color w:val="000000"/>
-          <w:sz w:val="22"/>
-          <w:szCs w:val="22"/>
-        </w:rPr>
-        <w:t>Computer</w:t>
-      </w:r>
-      <w:r>
-        <w:rPr>
-          <w:i/>
-          <w:color w:val="000000"/>
-          <w:spacing w:val="4"/>
-          <w:sz w:val="22"/>
-          <w:szCs w:val="22"/>
-        </w:rPr>
-        <w:t xml:space="preserve"> </w:t>
-      </w:r>
-      <w:r>
-        <w:rPr>
-          <w:i/>
-          <w:noProof/>
-          <w:color w:val="000000"/>
-          <w:sz w:val="22"/>
-          <w:szCs w:val="22"/>
-        </w:rPr>
-        <w:t>Science</w:t>
-      </w:r>
-      <w:r>
-        <w:rPr>
-          <w:i/>
-          <w:color w:val="000000"/>
-          <w:spacing w:val="7899"/>
-          <w:sz w:val="22"/>
-          <w:szCs w:val="22"/>
-        </w:rPr>
-        <w:t xml:space="preserve"> </w:t>
-      </w:r>
-      <w:r>
-        <w:rPr>
-          <w:i/>
-          <w:noProof/>
-          <w:color w:val="000000"/>
-          <w:sz w:val="22"/>
-          <w:szCs w:val="22"/>
-        </w:rPr>
-        <w:t>San</w:t>
-      </w:r>
-      <w:r>
-        <w:rPr>
-          <w:i/>
-          <w:color w:val="000000"/>
-          <w:spacing w:val="-1"/>
-          <w:sz w:val="22"/>
-          <w:szCs w:val="22"/>
-        </w:rPr>
-        <w:t xml:space="preserve"> </w:t>
-      </w:r>
-      <w:r>
-        <w:rPr>
-          <w:i/>
-          <w:noProof/>
-          <w:color w:val="000000"/>
-          <w:sz w:val="22"/>
-          <w:szCs w:val="22"/>
-        </w:rPr>
-        <w:t>Jose</w:t>
-      </w:r>
-    </w:p>
-    <w:p>
-      <w:pPr>
-        <w:widowControl w:val="0"/>
-        <w:numPr>
-          <w:ilvl w:val="0"/>
-          <w:numId w:val="1"/>
-        </w:numPr>
-        <w:kinsoku w:val="0"/>
-        <w:wordWrap w:val="0"/>
-        <w:autoSpaceDE w:val="0"/>
-        <w:autoSpaceDN w:val="0"/>
-        <w:adjustRightInd w:val="0"/>
-        <w:spacing w:line="246" w:lineRule="auto"/>
-        <w:textAlignment w:val="baseline"/>
-      </w:pPr>
-      <w:r>
-        <w:rPr>
-          <w:b/>
-          <w:noProof/>
-          <w:color w:val="000000"/>
-          <w:w w:val="99"/>
-          <w:sz w:val="22"/>
-          <w:szCs w:val="22"/>
-        </w:rPr>
-        <w:t>GP</w:t>
-      </w:r>
-      <w:r>
-        <w:rPr>
-          <w:b/>
-          <w:noProof/>
-          <w:color w:val="000000"/>
-          <w:sz w:val="22"/>
-          <w:szCs w:val="22"/>
-        </w:rPr>
-        <w:t>A:</w:t>
-      </w:r>
-      <w:r>
-        <w:rPr>
-          <w:b/>
-          <w:color w:val="000000"/>
-          <w:spacing w:val="2"/>
-          <w:w w:val="70"/>
-          <w:sz w:val="22"/>
-          <w:szCs w:val="22"/>
-        </w:rPr>
-        <w:t xml:space="preserve"> </w:t>
-      </w:r>
-      <w:r>
-        <w:rPr>
-          <w:noProof/>
-          <w:color w:val="000000"/>
-          <w:sz w:val="22"/>
-          <w:szCs w:val="22"/>
-        </w:rPr>
-        <w:t>3.88/4.00</w:t>
+          <w:noProof/>
+          <w:color w:val="000000"/>
+          <w:sz w:val="22"/>
+          <w:szCs w:val="22"/>
+        </w:rPr>
+        <w:t>tate University</w:t>
+      </w:r>
+      <w:r>
+        <w:rPr>
+          <w:noProof/>
+          <w:color w:val="000000"/>
+          <w:sz w:val="22"/>
+          <w:szCs w:val="22"/>
+        </w:rPr>
+        <w:tab/>
+      </w:r>
+      <w:r>
+        <w:rPr>
+          <w:noProof/>
+          <w:color w:val="000000"/>
+          <w:sz w:val="22"/>
+          <w:szCs w:val="22"/>
+        </w:rPr>
+        <w:tab/>
+      </w:r>
+      <w:r>
+        <w:rPr>
+          <w:noProof/>
+          <w:color w:val="000000"/>
+          <w:sz w:val="22"/>
+          <w:szCs w:val="22"/>
+        </w:rPr>
+        <w:tab/>
+      </w:r>
+      <w:r>
+        <w:rPr>
+          <w:noProof/>
+          <w:color w:val="000000"/>
+          <w:sz w:val="22"/>
+          <w:szCs w:val="22"/>
+        </w:rPr>
+        <w:tab/>
+      </w:r>
+      <w:r>
+        <w:rPr>
+          <w:noProof/>
+          <w:color w:val="000000"/>
+          <w:sz w:val="22"/>
+          <w:szCs w:val="22"/>
+        </w:rPr>
+        <w:tab/>
+      </w:r>
+      <w:r>
+        <w:rPr>
+          <w:noProof/>
+          <w:color w:val="000000"/>
+          <w:sz w:val="22"/>
+          <w:szCs w:val="22"/>
+        </w:rPr>
+        <w:tab/>
+      </w:r>
+      <w:r>
+        <w:rPr>
+          <w:noProof/>
+          <w:color w:val="000000"/>
+          <w:sz w:val="22"/>
+          <w:szCs w:val="22"/>
+        </w:rPr>
+        <w:tab/>
+      </w:r>
+      <w:r>
+        <w:rPr>
+          <w:noProof/>
+          <w:color w:val="000000"/>
+          <w:sz w:val="22"/>
+          <w:szCs w:val="22"/>
+        </w:rPr>
+        <w:tab/>
+      </w:r>
+      <w:r>
+        <w:rPr>
+          <w:noProof/>
+          <w:color w:val="000000"/>
+          <w:sz w:val="22"/>
+          <w:szCs w:val="22"/>
+        </w:rPr>
+        <w:tab/>
+      </w:r>
+      <w:r>
+        <w:rPr>
+          <w:noProof/>
+          <w:color w:val="000000"/>
+          <w:sz w:val="22"/>
+          <w:szCs w:val="22"/>
+        </w:rPr>
+        <w:tab/>
+        <w:t xml:space="preserve">  </w:t>
+      </w:r>
+      <w:r>
+        <w:rPr>
+          <w:noProof/>
+          <w:color w:val="000000"/>
+          <w:sz w:val="22"/>
+          <w:szCs w:val="22"/>
+        </w:rPr>
+        <w:t>GPA 3</w:t>
+      </w:r>
+      <w:r>
+        <w:rPr>
+          <w:noProof/>
+          <w:color w:val="000000"/>
+          <w:sz w:val="22"/>
+          <w:szCs w:val="22"/>
+        </w:rPr>
+        <w:t>.88/4.00</w:t>
       </w:r>
     </w:p>
     <w:p>
@@ -9860,7 +9499,7 @@
 </file>
 
 <file path=word/numbering.xml><?xml version="1.0" encoding="utf-8"?>
-<w:numbering xmlns:wpc="http://schemas.microsoft.com/office/word/2010/wordprocessingCanvas" xmlns:cx="http://schemas.microsoft.com/office/drawing/2014/chartex" xmlns:cx1="http://schemas.microsoft.com/office/drawing/2015/9/8/chartex" xmlns:cx2="http://schemas.microsoft.com/office/drawing/2015/10/21/chartex" xmlns:cx3="http://schemas.microsoft.com/office/drawing/2016/5/9/chartex" xmlns:cx4="http://schemas.microsoft.com/office/drawing/2016/5/10/chartex" xmlns:cx5="http://schemas.microsoft.com/office/drawing/2016/5/11/chartex" xmlns:cx6="http://schemas.microsoft.com/office/drawing/2016/5/12/chartex" xmlns:cx7="http://schemas.microsoft.com/office/drawing/2016/5/13/chartex" xmlns:cx8="http://schemas.microsoft.com/office/drawing/2016/5/14/chartex" xmlns:mc="http://schemas.openxmlformats.org/markup-compatibility/2006" xmlns:aink="http://schemas.microsoft.com/office/drawing/2016/ink" xmlns:am3d="http://schemas.microsoft.com/office/drawing/2017/model3d" xmlns:o="urn:schemas-microsoft-com:office:office" xmlns:oel="http://schemas.microsoft.com/office/2019/extlst" xmlns:r="http://schemas.openxmlformats.org/officeDocument/2006/relationships" xmlns:m="http://schemas.openxmlformats.org/officeDocument/2006/math" xmlns:v="urn:schemas-microsoft-com:vml" xmlns:wp14="http://schemas.microsoft.com/office/word/2010/wordprocessingDrawing" xmlns:wp="http://schemas.openxmlformats.org/drawingml/2006/wordprocessingDrawing" xmlns:w10="urn:schemas-microsoft-com:office:word" xmlns:w="http://schemas.openxmlformats.org/wordprocessingml/2006/main" xmlns:w14="http://schemas.microsoft.com/office/word/2010/wordml" xmlns:w15="http://schemas.microsoft.com/office/word/2012/wordml" xmlns:w16cei="http://schemas.microsoft.com/office/word/2026/wordml/cei" xmlns:w16cex="http://schemas.microsoft.com/office/word/2018/wordml/cex" xmlns:w16cid="http://schemas.microsoft.com/office/word/2016/wordml/cid" xmlns:w16="http://schemas.microsoft.com/office/word/2018/wordml" xmlns:w16du="http://schemas.microsoft.com/office/word/2023/wordml/word16du" xmlns:w16sdtdh="http://schemas.microsoft.com/office/word/2020/wordml/sdtdatahash" xmlns:w16sdtfl="http://schemas.microsoft.com/office/word/2024/wordml/sdtformatlock" xmlns:w16se="http://schemas.microsoft.com/office/word/2015/wordml/symex" xmlns:wpg="http://schemas.microsoft.com/office/word/2010/wordprocessingGroup" xmlns:wpi="http://schemas.microsoft.com/office/word/2010/wordprocessingInk" xmlns:wne="http://schemas.microsoft.com/office/word/2006/wordml" xmlns:wps="http://schemas.microsoft.com/office/word/2010/wordprocessingShape" mc:Ignorable="w14 w15 w16se w16cid w16 w16cex w16sdtdh w16sdtfl w16du wp14">
+<w:numbering xmlns:wpc="http://schemas.microsoft.com/office/word/2010/wordprocessingCanvas" xmlns:cx="http://schemas.microsoft.com/office/drawing/2014/chartex" xmlns:cx1="http://schemas.microsoft.com/office/drawing/2015/9/8/chartex" xmlns:cx2="http://schemas.microsoft.com/office/drawing/2015/10/21/chartex" xmlns:cx3="http://schemas.microsoft.com/office/drawing/2016/5/9/chartex" xmlns:cx4="http://schemas.microsoft.com/office/drawing/2016/5/10/chartex" xmlns:cx5="http://schemas.microsoft.com/office/drawing/2016/5/11/chartex" xmlns:cx6="http://schemas.microsoft.com/office/drawing/2016/5/12/chartex" xmlns:cx7="http://schemas.microsoft.com/office/drawing/2016/5/13/chartex" xmlns:cx8="http://schemas.microsoft.com/office/drawing/2016/5/14/chartex" xmlns:mc="http://schemas.openxmlformats.org/markup-compatibility/2006" xmlns:aink="http://schemas.microsoft.com/office/drawing/2016/ink" xmlns:am3d="http://schemas.microsoft.com/office/drawing/2017/model3d" xmlns:o="urn:schemas-microsoft-com:office:office" xmlns:oel="http://schemas.microsoft.com/office/2019/extlst" xmlns:r="http://schemas.openxmlformats.org/officeDocument/2006/relationships" xmlns:m="http://schemas.openxmlformats.org/officeDocument/2006/math" xmlns:v="urn:schemas-microsoft-com:vml" xmlns:wp14="http://schemas.microsoft.com/office/word/2010/wordprocessingDrawing" xmlns:wp="http://schemas.openxmlformats.org/drawingml/2006/wordprocessingDrawing" xmlns:w10="urn:schemas-microsoft-com:office:word" xmlns:w="http://schemas.openxmlformats.org/wordprocessingml/2006/main" xmlns:w14="http://schemas.microsoft.com/office/word/2010/wordml" xmlns:w15="http://schemas.microsoft.com/office/word/2012/wordml" xmlns:w16cex="http://schemas.microsoft.com/office/word/2018/wordml/cex" xmlns:w16cid="http://schemas.microsoft.com/office/word/2016/wordml/cid" xmlns:w16="http://schemas.microsoft.com/office/word/2018/wordml" xmlns:w16du="http://schemas.microsoft.com/office/word/2023/wordml/word16du" xmlns:w16sdtdh="http://schemas.microsoft.com/office/word/2020/wordml/sdtdatahash" xmlns:w16sdtfl="http://schemas.microsoft.com/office/word/2024/wordml/sdtformatlock" xmlns:w16se="http://schemas.microsoft.com/office/word/2015/wordml/symex" xmlns:wpg="http://schemas.microsoft.com/office/word/2010/wordprocessingGroup" xmlns:wpi="http://schemas.microsoft.com/office/word/2010/wordprocessingInk" xmlns:wne="http://schemas.microsoft.com/office/word/2006/wordml" xmlns:wps="http://schemas.microsoft.com/office/word/2010/wordprocessingShape" mc:Ignorable="w14 w15 w16se w16cid w16 w16cex w16sdtdh w16sdtfl w16du wp14">
   <w:abstractNum w:abstractNumId="0" w15:restartNumberingAfterBreak="0">
     <w:nsid w:val="1F96732B"/>
     <w:multiLevelType w:val="singleLevel"/>

</xml_diff>